<commit_message>
feat: release v3.0.0 with hi-res interactive A4 canvas, two-way sync, local snapshots, global formatting offsets, and AI STAR polish
</commit_message>
<xml_diff>
--- a/templates/文艺单页01.docxtpl.docx
+++ b/templates/文艺单页01.docxtpl.docx
@@ -72,6 +72,7 @@
       <w:r>
         <w:rPr>
           <w:sz w:val="21"/>
+          <w:rFonts w:ascii="微软雅黑" w:hAnsi="微软雅黑" w:eastAsia="微软雅黑" w:cs="微软雅黑" w:hint="eastAsia"/>
         </w:rPr>
         <mc:AlternateContent>
           <mc:Choice Requires="wps">
@@ -122,7 +123,7 @@
                       </wps:style>
                       <wps:txbx>
                         <w:txbxContent>
-                          <w:p>
+                          <w:p delIfEmpty="1">
                             <w:pPr>
                               <w:keepNext w:val="0"/>
                               <w:keepLines w:val="0"/>
@@ -153,13 +154,13 @@
                             </w:pPr>
                             <w:r>
                               <w:rPr>
-                                <w:rFonts w:hint="eastAsia" w:ascii="微软雅黑" w:hAnsi="微软雅黑" w:eastAsia="微软雅黑"/>
+                                <w:rFonts w:hint="eastAsia" w:ascii="微软雅黑" w:hAnsi="微软雅黑" w:eastAsia="微软雅黑" w:cs="微软雅黑"/>
                                 <w:color w:val="333333"/>
                               </w:rPr>
                               <w:t>{{ summary }}</w:t>
                             </w:r>
                           </w:p>
-                          <w:p>
+                          <w:p delIfEmpty="1">
                             <w:pPr>
                               <w:keepNext w:val="0"/>
                               <w:keepLines w:val="0"/>
@@ -193,10 +194,10 @@
                                 <w:rFonts w:hint="eastAsia" w:ascii="微软雅黑" w:hAnsi="微软雅黑" w:eastAsia="微软雅黑"/>
                                 <w:color w:val="333333"/>
                               </w:rPr>
-                              <w:t>娴熟操作Photoshop、Illustrator、Indesin等平面软件</w:t>
+                              <w:t/>
                             </w:r>
                           </w:p>
-                          <w:p>
+                          <w:p delIfEmpty="1">
                             <w:pPr>
                               <w:keepNext w:val="0"/>
                               <w:keepLines w:val="0"/>
@@ -230,10 +231,10 @@
                                 <w:rFonts w:hint="eastAsia" w:ascii="微软雅黑" w:hAnsi="微软雅黑" w:eastAsia="微软雅黑"/>
                                 <w:color w:val="333333"/>
                               </w:rPr>
-                              <w:t>坚持不懈的创作激情，能独立完成各项设计任务</w:t>
+                              <w:t/>
                             </w:r>
                           </w:p>
-                          <w:p>
+                          <w:p delIfEmpty="1">
                             <w:pPr>
                               <w:keepNext w:val="0"/>
                               <w:keepLines w:val="0"/>
@@ -267,7 +268,7 @@
                                 <w:rFonts w:hint="eastAsia" w:ascii="微软雅黑" w:hAnsi="微软雅黑" w:eastAsia="微软雅黑"/>
                                 <w:color w:val="333333"/>
                               </w:rPr>
-                              <w:t>严格要求自己，待人热情，能吃苦耐劳，沟通，协调能力强</w:t>
+                              <w:t/>
                             </w:r>
                           </w:p>
                         </w:txbxContent>
@@ -290,7 +291,7 @@
                 <o:lock v:ext="edit" aspectratio="f"/>
                 <v:textbox style="mso-fit-shape-to-text:t;">
                   <w:txbxContent>
-                    <w:p>
+                    <w:p delIfEmpty="1">
                       <w:pPr>
                         <w:keepNext w:val="0"/>
                         <w:keepLines w:val="0"/>
@@ -321,13 +322,13 @@
                       </w:pPr>
                       <w:r>
                         <w:rPr>
-                          <w:rFonts w:hint="eastAsia" w:ascii="微软雅黑" w:hAnsi="微软雅黑" w:eastAsia="微软雅黑"/>
+                          <w:rFonts w:hint="eastAsia" w:ascii="微软雅黑" w:hAnsi="微软雅黑" w:eastAsia="微软雅黑" w:cs="微软雅黑"/>
                           <w:color w:val="333333"/>
                         </w:rPr>
                         <w:t>{{ summary }}</w:t>
                       </w:r>
                     </w:p>
-                    <w:p>
+                    <w:p delIfEmpty="1">
                       <w:pPr>
                         <w:keepNext w:val="0"/>
                         <w:keepLines w:val="0"/>
@@ -361,10 +362,10 @@
                           <w:rFonts w:hint="eastAsia" w:ascii="微软雅黑" w:hAnsi="微软雅黑" w:eastAsia="微软雅黑"/>
                           <w:color w:val="333333"/>
                         </w:rPr>
-                        <w:t>娴熟操作Photoshop、Illustrator、Indesin等平面软件</w:t>
+                        <w:t/>
                       </w:r>
                     </w:p>
-                    <w:p>
+                    <w:p delIfEmpty="1">
                       <w:pPr>
                         <w:keepNext w:val="0"/>
                         <w:keepLines w:val="0"/>
@@ -398,10 +399,10 @@
                           <w:rFonts w:hint="eastAsia" w:ascii="微软雅黑" w:hAnsi="微软雅黑" w:eastAsia="微软雅黑"/>
                           <w:color w:val="333333"/>
                         </w:rPr>
-                        <w:t>坚持不懈的创作激情，能独立完成各项设计任务</w:t>
+                        <w:t/>
                       </w:r>
                     </w:p>
-                    <w:p>
+                    <w:p delIfEmpty="1">
                       <w:pPr>
                         <w:keepNext w:val="0"/>
                         <w:keepLines w:val="0"/>
@@ -435,7 +436,7 @@
                           <w:rFonts w:hint="eastAsia" w:ascii="微软雅黑" w:hAnsi="微软雅黑" w:eastAsia="微软雅黑"/>
                           <w:color w:val="333333"/>
                         </w:rPr>
-                        <w:t>严格要求自己，待人热情，能吃苦耐劳，沟通，协调能力强</w:t>
+                        <w:t/>
                       </w:r>
                     </w:p>
                   </w:txbxContent>
@@ -1012,6 +1013,7 @@
       <w:r>
         <w:rPr>
           <w:sz w:val="21"/>
+          <w:rFonts w:ascii="微软雅黑" w:hAnsi="微软雅黑" w:eastAsia="微软雅黑" w:cs="微软雅黑" w:hint="eastAsia"/>
         </w:rPr>
         <mc:AlternateContent>
           <mc:Choice Requires="wps">
@@ -1088,10 +1090,10 @@
                             </w:pPr>
                             <w:r>
                               <w:rPr>
-                                <w:rFonts w:hint="eastAsia" w:ascii="微软雅黑" w:hAnsi="微软雅黑" w:eastAsia="微软雅黑"/>
+                                <w:rFonts w:hint="eastAsia" w:ascii="微软雅黑" w:hAnsi="微软雅黑" w:eastAsia="微软雅黑" w:cs="微软雅黑"/>
                                 <w:color w:val="47BAC2"/>
                               </w:rPr>
-                              <w:t>{{ edu_school }}</w:t>
+                              <w:t>{{ edu_school1 }}</w:t>
                             </w:r>
                             <w:r>
                               <w:rPr>
@@ -1102,10 +1104,10 @@
                             </w:r>
                             <w:r>
                               <w:rPr>
-                                <w:rFonts w:hint="eastAsia" w:ascii="微软雅黑" w:hAnsi="微软雅黑" w:eastAsia="微软雅黑"/>
+                                <w:rFonts w:hint="eastAsia" w:ascii="微软雅黑" w:hAnsi="微软雅黑" w:eastAsia="微软雅黑" w:cs="微软雅黑"/>
                                 <w:color w:val="47BAC2"/>
                               </w:rPr>
-                              <w:t xml:space="preserve">     {{ edu_major }}</w:t>
+                              <w:t xml:space="preserve">     {{ edu_major1 }}</w:t>
                             </w:r>
                             <w:r>
                               <w:rPr>
@@ -1116,10 +1118,10 @@
                             </w:r>
                             <w:r>
                               <w:rPr>
-                                <w:rFonts w:hint="eastAsia" w:ascii="微软雅黑" w:hAnsi="微软雅黑" w:eastAsia="微软雅黑"/>
+                                <w:rFonts w:hint="eastAsia" w:ascii="微软雅黑" w:hAnsi="微软雅黑" w:eastAsia="微软雅黑" w:cs="微软雅黑"/>
                                 <w:color w:val="47BAC2"/>
                               </w:rPr>
-                              <w:t xml:space="preserve">     {{ edu_date }}</w:t>
+                              <w:t xml:space="preserve">     {{ edu_date1 }}</w:t>
                             </w:r>
                           </w:p>
                           <w:p>
@@ -1152,10 +1154,10 @@
                             </w:pPr>
                             <w:r>
                               <w:rPr>
-                                <w:rFonts w:hint="eastAsia" w:ascii="微软雅黑" w:hAnsi="微软雅黑" w:eastAsia="微软雅黑"/>
+                                <w:rFonts w:hint="eastAsia" w:ascii="微软雅黑" w:hAnsi="微软雅黑" w:eastAsia="微软雅黑" w:cs="微软雅黑"/>
                                 <w:color w:val="333333"/>
                               </w:rPr>
-                              <w:t>专业摄影及摄影作品欣赏、专业摄影技术、出版物设计、古典工艺、超级写实油画、包装设计、广告摄影、印刷艺术与书籍装帧设计、设计艺术学概论、设计色彩等</w:t>
+                              <w:t>{{ edu_desc1 }}</w:t>
                             </w:r>
                           </w:p>
                         </w:txbxContent>
@@ -1204,10 +1206,10 @@
                       </w:pPr>
                       <w:r>
                         <w:rPr>
-                          <w:rFonts w:hint="eastAsia" w:ascii="微软雅黑" w:hAnsi="微软雅黑" w:eastAsia="微软雅黑"/>
+                          <w:rFonts w:hint="eastAsia" w:ascii="微软雅黑" w:hAnsi="微软雅黑" w:eastAsia="微软雅黑" w:cs="微软雅黑"/>
                           <w:color w:val="47BAC2"/>
                         </w:rPr>
-                        <w:t>{{ edu_school }}</w:t>
+                        <w:t>{{ edu_school1 }}</w:t>
                       </w:r>
                       <w:r>
                         <w:rPr>
@@ -1218,10 +1220,10 @@
                       </w:r>
                       <w:r>
                         <w:rPr>
-                          <w:rFonts w:hint="eastAsia" w:ascii="微软雅黑" w:hAnsi="微软雅黑" w:eastAsia="微软雅黑"/>
+                          <w:rFonts w:hint="eastAsia" w:ascii="微软雅黑" w:hAnsi="微软雅黑" w:eastAsia="微软雅黑" w:cs="微软雅黑"/>
                           <w:color w:val="47BAC2"/>
                         </w:rPr>
-                        <w:t xml:space="preserve">     {{ edu_major }}</w:t>
+                        <w:t xml:space="preserve">     {{ edu_major1 }}</w:t>
                       </w:r>
                       <w:r>
                         <w:rPr>
@@ -1232,10 +1234,10 @@
                       </w:r>
                       <w:r>
                         <w:rPr>
-                          <w:rFonts w:hint="eastAsia" w:ascii="微软雅黑" w:hAnsi="微软雅黑" w:eastAsia="微软雅黑"/>
+                          <w:rFonts w:hint="eastAsia" w:ascii="微软雅黑" w:hAnsi="微软雅黑" w:eastAsia="微软雅黑" w:cs="微软雅黑"/>
                           <w:color w:val="47BAC2"/>
                         </w:rPr>
-                        <w:t xml:space="preserve">     {{ edu_date }}</w:t>
+                        <w:t xml:space="preserve">     {{ edu_date1 }}</w:t>
                       </w:r>
                     </w:p>
                     <w:p>
@@ -1268,10 +1270,10 @@
                       </w:pPr>
                       <w:r>
                         <w:rPr>
-                          <w:rFonts w:hint="eastAsia" w:ascii="微软雅黑" w:hAnsi="微软雅黑" w:eastAsia="微软雅黑"/>
+                          <w:rFonts w:hint="eastAsia" w:ascii="微软雅黑" w:hAnsi="微软雅黑" w:eastAsia="微软雅黑" w:cs="微软雅黑"/>
                           <w:color w:val="333333"/>
                         </w:rPr>
-                        <w:t>专业摄影及摄影作品欣赏、专业摄影技术、出版物设计、古典工艺、超级写实油画、包装设计、广告摄影、印刷艺术与书籍装帧设计、设计艺术学概论、设计色彩等</w:t>
+                        <w:t>{{ edu_desc1 }}</w:t>
                       </w:r>
                     </w:p>
                   </w:txbxContent>
@@ -1284,6 +1286,7 @@
       <w:r>
         <w:rPr>
           <w:sz w:val="21"/>
+          <w:rFonts w:ascii="微软雅黑" w:hAnsi="微软雅黑" w:eastAsia="微软雅黑" w:cs="微软雅黑" w:hint="eastAsia"/>
         </w:rPr>
         <mc:AlternateContent>
           <mc:Choice Requires="wps">
@@ -1357,7 +1360,7 @@
                             </w:pPr>
                             <w:r>
                               <w:rPr>
-                                <w:rFonts w:hint="eastAsia" w:ascii="微软雅黑" w:hAnsi="微软雅黑" w:eastAsia="微软雅黑"/>
+                                <w:rFonts w:hint="eastAsia" w:ascii="微软雅黑" w:hAnsi="微软雅黑" w:eastAsia="微软雅黑" w:cs="微软雅黑"/>
                                 <w:color w:val="333333"/>
                                 <w:sz w:val="28"/>
                                 <w:szCs w:val="28"/>
@@ -1408,7 +1411,7 @@
                       </w:pPr>
                       <w:r>
                         <w:rPr>
-                          <w:rFonts w:hint="eastAsia" w:ascii="微软雅黑" w:hAnsi="微软雅黑" w:eastAsia="微软雅黑"/>
+                          <w:rFonts w:hint="eastAsia" w:ascii="微软雅黑" w:hAnsi="微软雅黑" w:eastAsia="微软雅黑" w:cs="微软雅黑"/>
                           <w:color w:val="333333"/>
                           <w:sz w:val="28"/>
                           <w:szCs w:val="28"/>
@@ -1426,6 +1429,7 @@
       <w:r>
         <w:rPr>
           <w:sz w:val="21"/>
+          <w:rFonts w:ascii="微软雅黑" w:hAnsi="微软雅黑" w:eastAsia="微软雅黑" w:cs="微软雅黑" w:hint="eastAsia"/>
         </w:rPr>
         <mc:AlternateContent>
           <mc:Choice Requires="wps">
@@ -1499,7 +1503,7 @@
                             </w:pPr>
                             <w:r>
                               <w:rPr>
-                                <w:rFonts w:hint="eastAsia" w:ascii="微软雅黑" w:hAnsi="微软雅黑" w:eastAsia="微软雅黑"/>
+                                <w:rFonts w:hint="eastAsia" w:ascii="微软雅黑" w:hAnsi="微软雅黑" w:eastAsia="微软雅黑" w:cs="微软雅黑"/>
                                 <w:b/>
                                 <w:bCs/>
                                 <w:color w:val="333333"/>
@@ -1552,7 +1556,7 @@
                       </w:pPr>
                       <w:r>
                         <w:rPr>
-                          <w:rFonts w:hint="eastAsia" w:ascii="微软雅黑" w:hAnsi="微软雅黑" w:eastAsia="微软雅黑"/>
+                          <w:rFonts w:hint="eastAsia" w:ascii="微软雅黑" w:hAnsi="微软雅黑" w:eastAsia="微软雅黑" w:cs="微软雅黑"/>
                           <w:b/>
                           <w:bCs/>
                           <w:color w:val="333333"/>
@@ -1836,6 +1840,7 @@
       <w:r>
         <w:rPr>
           <w:sz w:val="21"/>
+          <w:rFonts w:ascii="微软雅黑" w:hAnsi="微软雅黑" w:eastAsia="微软雅黑" w:cs="微软雅黑" w:hint="eastAsia"/>
         </w:rPr>
         <mc:AlternateContent>
           <mc:Choice Requires="wps">
@@ -1985,7 +1990,7 @@
                                 <w:color w:val="333333"/>
                                 <w:szCs w:val="21"/>
                               </w:rPr>
-                              <w:t>{{ edu_major }}</w:t>
+                              <w:t>{{ basic_major }}</w:t>
                             </w:r>
                           </w:p>
                           <w:p>
@@ -2036,7 +2041,7 @@
                                 <w:color w:val="333333"/>
                                 <w:szCs w:val="21"/>
                               </w:rPr>
-                              <w:t>{{ basic_degree }}</w:t>
+                              <w:t>{{ degree }}</w:t>
                             </w:r>
                           </w:p>
                           <w:p>
@@ -2087,7 +2092,7 @@
                                 <w:color w:val="333333"/>
                                 <w:szCs w:val="21"/>
                               </w:rPr>
-                              <w:t>{{ basic_age }}</w:t>
+                              <w:t>{{ age }}</w:t>
                             </w:r>
                           </w:p>
                           <w:p>
@@ -2138,7 +2143,7 @@
                                 <w:color w:val="333333"/>
                                 <w:szCs w:val="21"/>
                               </w:rPr>
-                              <w:t>{{ basic_address }}</w:t>
+                              <w:t>{{ address }}</w:t>
                             </w:r>
                           </w:p>
                           <w:p>
@@ -2357,7 +2362,7 @@
                           <w:color w:val="333333"/>
                           <w:szCs w:val="21"/>
                         </w:rPr>
-                        <w:t>{{ edu_major }}</w:t>
+                        <w:t>{{ basic_major }}</w:t>
                       </w:r>
                     </w:p>
                     <w:p>
@@ -2408,7 +2413,7 @@
                           <w:color w:val="333333"/>
                           <w:szCs w:val="21"/>
                         </w:rPr>
-                        <w:t>{{ basic_degree }}</w:t>
+                        <w:t>{{ degree }}</w:t>
                       </w:r>
                     </w:p>
                     <w:p>
@@ -2459,7 +2464,7 @@
                           <w:color w:val="333333"/>
                           <w:szCs w:val="21"/>
                         </w:rPr>
-                        <w:t>{{ basic_age }}</w:t>
+                        <w:t>{{ age }}</w:t>
                       </w:r>
                     </w:p>
                     <w:p>
@@ -2510,7 +2515,7 @@
                           <w:color w:val="333333"/>
                           <w:szCs w:val="21"/>
                         </w:rPr>
-                        <w:t>{{ basic_address }}</w:t>
+                        <w:t>{{ address }}</w:t>
                       </w:r>
                     </w:p>
                     <w:p>
@@ -2878,6 +2883,7 @@
       <w:r>
         <w:rPr>
           <w:sz w:val="21"/>
+          <w:rFonts w:ascii="微软雅黑" w:hAnsi="微软雅黑" w:eastAsia="微软雅黑" w:cs="微软雅黑" w:hint="eastAsia"/>
         </w:rPr>
         <mc:AlternateContent>
           <mc:Choice Requires="wps">
@@ -2954,10 +2960,10 @@
                             </w:pPr>
                             <w:r>
                               <w:rPr>
-                                <w:rFonts w:hint="eastAsia" w:ascii="微软雅黑" w:hAnsi="微软雅黑" w:eastAsia="微软雅黑"/>
+                                <w:rFonts w:hint="eastAsia" w:ascii="微软雅黑" w:hAnsi="微软雅黑" w:eastAsia="微软雅黑" w:cs="微软雅黑"/>
                                 <w:color w:val="47BAC2"/>
                               </w:rPr>
-                              <w:t>{{ exp_company }}</w:t>
+                              <w:t>{{ exp_company1 }}</w:t>
                             </w:r>
                             <w:r>
                               <w:rPr>
@@ -2968,10 +2974,10 @@
                             </w:r>
                             <w:r>
                               <w:rPr>
-                                <w:rFonts w:hint="eastAsia" w:ascii="微软雅黑" w:hAnsi="微软雅黑" w:eastAsia="微软雅黑"/>
+                                <w:rFonts w:hint="eastAsia" w:ascii="微软雅黑" w:hAnsi="微软雅黑" w:eastAsia="微软雅黑" w:cs="微软雅黑"/>
                                 <w:color w:val="47BAC2"/>
                               </w:rPr>
-                              <w:t xml:space="preserve">     {{ exp_role }}</w:t>
+                              <w:t xml:space="preserve">     {{ exp_role1 }}</w:t>
                             </w:r>
                             <w:r>
                               <w:rPr>
@@ -2982,10 +2988,10 @@
                             </w:r>
                             <w:r>
                               <w:rPr>
-                                <w:rFonts w:hint="eastAsia" w:ascii="微软雅黑" w:hAnsi="微软雅黑" w:eastAsia="微软雅黑"/>
+                                <w:rFonts w:hint="eastAsia" w:ascii="微软雅黑" w:hAnsi="微软雅黑" w:eastAsia="微软雅黑" w:cs="微软雅黑"/>
                                 <w:color w:val="47BAC2"/>
                               </w:rPr>
-                              <w:t xml:space="preserve">        {{ edu_date }}</w:t>
+                              <w:t xml:space="preserve">        {{ exp_date1 }}</w:t>
                             </w:r>
                           </w:p>
                           <w:p>
@@ -3018,10 +3024,142 @@
                             </w:pPr>
                             <w:r>
                               <w:rPr>
+                                <w:rFonts w:hint="eastAsia" w:ascii="微软雅黑" w:hAnsi="微软雅黑" w:eastAsia="微软雅黑" w:cs="微软雅黑"/>
+                                <w:color w:val="333333"/>
+                              </w:rPr>
+                              <w:t>{{ exp_desc1 }}</w:t>
+                            </w:r>
+                          </w:p>
+                          <w:p delIfEmpty="1">
+                            <w:pPr>
+                              <w:keepNext w:val="0"/>
+                              <w:keepLines w:val="0"/>
+                              <w:pageBreakBefore w:val="0"/>
+                              <w:widowControl w:val="0"/>
+                              <w:numPr>
+                                <w:ilvl w:val="0"/>
+                                <w:numId w:val="1"/>
+                              </w:numPr>
+                              <w:kinsoku/>
+                              <w:wordWrap/>
+                              <w:overflowPunct/>
+                              <w:topLinePunct w:val="0"/>
+                              <w:autoSpaceDE/>
+                              <w:autoSpaceDN/>
+                              <w:bidi w:val="0"/>
+                              <w:adjustRightInd/>
+                              <w:spacing w:line="360" w:lineRule="exact"/>
+                              <w:ind w:right="0" w:rightChars="0"/>
+                              <w:jc w:val="left"/>
+                              <w:textAlignment w:val="auto"/>
+                              <w:outlineLvl w:val="9"/>
+                              <w:rPr>
+                                <w:rFonts w:ascii="微软雅黑" w:hAnsi="微软雅黑" w:eastAsia="微软雅黑"/>
+                                <w:color w:val="333333"/>
+                              </w:rPr>
+                            </w:pPr>
+                            <w:r>
+                              <w:rPr>
                                 <w:rFonts w:hint="eastAsia" w:ascii="微软雅黑" w:hAnsi="微软雅黑" w:eastAsia="微软雅黑"/>
                                 <w:color w:val="333333"/>
                               </w:rPr>
-                              <w:t>从事科普漫画的绘制，并担任漫画主笔</w:t>
+                              <w:t/>
+                            </w:r>
+                          </w:p>
+                          <w:p delIfEmpty="1">
+                            <w:pPr>
+                              <w:keepNext w:val="0"/>
+                              <w:keepLines w:val="0"/>
+                              <w:pageBreakBefore w:val="0"/>
+                              <w:widowControl w:val="0"/>
+                              <w:numPr>
+                                <w:ilvl w:val="0"/>
+                                <w:numId w:val="1"/>
+                              </w:numPr>
+                              <w:kinsoku/>
+                              <w:wordWrap/>
+                              <w:overflowPunct/>
+                              <w:topLinePunct w:val="0"/>
+                              <w:autoSpaceDE/>
+                              <w:autoSpaceDN/>
+                              <w:bidi w:val="0"/>
+                              <w:adjustRightInd/>
+                              <w:spacing w:line="360" w:lineRule="exact"/>
+                              <w:ind w:right="0" w:rightChars="0"/>
+                              <w:jc w:val="left"/>
+                              <w:textAlignment w:val="auto"/>
+                              <w:outlineLvl w:val="9"/>
+                              <w:rPr>
+                                <w:rFonts w:hint="eastAsia" w:ascii="微软雅黑" w:hAnsi="微软雅黑" w:eastAsia="微软雅黑"/>
+                                <w:color w:val="333333"/>
+                              </w:rPr>
+                            </w:pPr>
+                            <w:r>
+                              <w:rPr>
+                                <w:rFonts w:hint="eastAsia" w:ascii="微软雅黑" w:hAnsi="微软雅黑" w:eastAsia="微软雅黑"/>
+                                <w:color w:val="333333"/>
+                              </w:rPr>
+                              <w:t/>
+                            </w:r>
+                          </w:p>
+                          <w:p>
+                            <w:pPr>
+                              <w:keepNext w:val="0"/>
+                              <w:keepLines w:val="0"/>
+                              <w:pageBreakBefore w:val="0"/>
+                              <w:widowControl w:val="0"/>
+                              <w:kinsoku/>
+                              <w:wordWrap/>
+                              <w:overflowPunct/>
+                              <w:topLinePunct w:val="0"/>
+                              <w:autoSpaceDE/>
+                              <w:autoSpaceDN/>
+                              <w:bidi w:val="0"/>
+                              <w:adjustRightInd/>
+                              <w:snapToGrid w:val="0"/>
+                              <w:spacing w:line="360" w:lineRule="exact"/>
+                              <w:ind w:right="0" w:rightChars="0"/>
+                              <w:textAlignment w:val="auto"/>
+                              <w:outlineLvl w:val="9"/>
+                              <w:rPr>
+                                <w:rFonts w:hint="eastAsia" w:ascii="微软雅黑" w:hAnsi="微软雅黑" w:eastAsia="微软雅黑"/>
+                                <w:color w:val="47BAC2"/>
+                              </w:rPr>
+                            </w:pPr>
+                            <w:r>
+                              <w:rPr>
+                                <w:rFonts w:hint="eastAsia" w:ascii="微软雅黑" w:hAnsi="微软雅黑" w:eastAsia="微软雅黑" w:cs="微软雅黑"/>
+                                <w:color w:val="47BAC2"/>
+                              </w:rPr>
+                              <w:t>{{ exp_company1 }}</w:t>
+                            </w:r>
+                            <w:r>
+                              <w:rPr>
+                                <w:rFonts w:hint="eastAsia" w:ascii="微软雅黑" w:hAnsi="微软雅黑" w:eastAsia="微软雅黑"/>
+                                <w:color w:val="47BAC2"/>
+                              </w:rPr>
+                              <w:tab/>
+                            </w:r>
+                            <w:r>
+                              <w:rPr>
+                                <w:rFonts w:hint="eastAsia" w:ascii="微软雅黑" w:hAnsi="微软雅黑" w:eastAsia="微软雅黑" w:cs="微软雅黑"/>
+                                <w:color w:val="47BAC2"/>
+                              </w:rPr>
+                              <w:t xml:space="preserve">     {{ exp_role1 }}</w:t>
+                            </w:r>
+                            <w:r>
+                              <w:rPr>
+                                <w:rFonts w:hint="eastAsia" w:ascii="微软雅黑" w:hAnsi="微软雅黑" w:eastAsia="微软雅黑"/>
+                                <w:color w:val="47BAC2"/>
+                              </w:rPr>
+                              <w:tab/>
+                            </w:r>
+                            <w:r>
+                              <w:rPr>
+                                <w:rFonts w:hint="eastAsia" w:ascii="微软雅黑" w:hAnsi="微软雅黑" w:eastAsia="微软雅黑" w:cs="微软雅黑"/>
+                                <w:color w:val="47BAC2"/>
+                              </w:rPr>
+                              <w:t xml:space="preserve">        {{ exp_date1 }}</w:t>
                             </w:r>
                           </w:p>
                           <w:p>
@@ -3054,13 +3192,13 @@
                             </w:pPr>
                             <w:r>
                               <w:rPr>
-                                <w:rFonts w:hint="eastAsia" w:ascii="微软雅黑" w:hAnsi="微软雅黑" w:eastAsia="微软雅黑"/>
+                                <w:rFonts w:hint="eastAsia" w:ascii="微软雅黑" w:hAnsi="微软雅黑" w:eastAsia="微软雅黑" w:cs="微软雅黑"/>
                                 <w:color w:val="333333"/>
                               </w:rPr>
-                              <w:t>负责设定人物形象，整体风格，色彩等</w:t>
+                              <w:t>{{ exp_desc1 }}</w:t>
                             </w:r>
                           </w:p>
-                          <w:p>
+                          <w:p delIfEmpty="1">
                             <w:pPr>
                               <w:keepNext w:val="0"/>
                               <w:keepLines w:val="0"/>
@@ -3084,79 +3222,19 @@
                               <w:textAlignment w:val="auto"/>
                               <w:outlineLvl w:val="9"/>
                               <w:rPr>
+                                <w:rFonts w:ascii="微软雅黑" w:hAnsi="微软雅黑" w:eastAsia="微软雅黑"/>
+                                <w:color w:val="333333"/>
+                              </w:rPr>
+                            </w:pPr>
+                            <w:r>
+                              <w:rPr>
                                 <w:rFonts w:hint="eastAsia" w:ascii="微软雅黑" w:hAnsi="微软雅黑" w:eastAsia="微软雅黑"/>
                                 <w:color w:val="333333"/>
                               </w:rPr>
-                            </w:pPr>
-                            <w:r>
-                              <w:rPr>
-                                <w:rFonts w:hint="eastAsia" w:ascii="微软雅黑" w:hAnsi="微软雅黑" w:eastAsia="微软雅黑"/>
-                                <w:color w:val="333333"/>
-                              </w:rPr>
-                              <w:t>分配其他漫画师的工作，保证作品能按时并且高质量完成</w:t>
+                              <w:t/>
                             </w:r>
                           </w:p>
-                          <w:p>
-                            <w:pPr>
-                              <w:keepNext w:val="0"/>
-                              <w:keepLines w:val="0"/>
-                              <w:pageBreakBefore w:val="0"/>
-                              <w:widowControl w:val="0"/>
-                              <w:kinsoku/>
-                              <w:wordWrap/>
-                              <w:overflowPunct/>
-                              <w:topLinePunct w:val="0"/>
-                              <w:autoSpaceDE/>
-                              <w:autoSpaceDN/>
-                              <w:bidi w:val="0"/>
-                              <w:adjustRightInd/>
-                              <w:snapToGrid w:val="0"/>
-                              <w:spacing w:line="360" w:lineRule="exact"/>
-                              <w:ind w:right="0" w:rightChars="0"/>
-                              <w:textAlignment w:val="auto"/>
-                              <w:outlineLvl w:val="9"/>
-                              <w:rPr>
-                                <w:rFonts w:hint="eastAsia" w:ascii="微软雅黑" w:hAnsi="微软雅黑" w:eastAsia="微软雅黑"/>
-                                <w:color w:val="47BAC2"/>
-                              </w:rPr>
-                            </w:pPr>
-                            <w:r>
-                              <w:rPr>
-                                <w:rFonts w:hint="eastAsia" w:ascii="微软雅黑" w:hAnsi="微软雅黑" w:eastAsia="微软雅黑"/>
-                                <w:color w:val="47BAC2"/>
-                              </w:rPr>
-                              <w:t>{{ exp_company }}</w:t>
-                            </w:r>
-                            <w:r>
-                              <w:rPr>
-                                <w:rFonts w:hint="eastAsia" w:ascii="微软雅黑" w:hAnsi="微软雅黑" w:eastAsia="微软雅黑"/>
-                                <w:color w:val="47BAC2"/>
-                              </w:rPr>
-                              <w:tab/>
-                            </w:r>
-                            <w:r>
-                              <w:rPr>
-                                <w:rFonts w:hint="eastAsia" w:ascii="微软雅黑" w:hAnsi="微软雅黑" w:eastAsia="微软雅黑"/>
-                                <w:color w:val="47BAC2"/>
-                              </w:rPr>
-                              <w:t xml:space="preserve">     {{ exp_role }}</w:t>
-                            </w:r>
-                            <w:r>
-                              <w:rPr>
-                                <w:rFonts w:hint="eastAsia" w:ascii="微软雅黑" w:hAnsi="微软雅黑" w:eastAsia="微软雅黑"/>
-                                <w:color w:val="47BAC2"/>
-                              </w:rPr>
-                              <w:tab/>
-                            </w:r>
-                            <w:r>
-                              <w:rPr>
-                                <w:rFonts w:hint="eastAsia" w:ascii="微软雅黑" w:hAnsi="微软雅黑" w:eastAsia="微软雅黑"/>
-                                <w:color w:val="47BAC2"/>
-                              </w:rPr>
-                              <w:t xml:space="preserve">        {{ edu_date }}</w:t>
-                            </w:r>
-                          </w:p>
-                          <w:p>
+                          <w:p delIfEmpty="1">
                             <w:pPr>
                               <w:keepNext w:val="0"/>
                               <w:keepLines w:val="0"/>
@@ -3180,7 +3258,7 @@
                               <w:textAlignment w:val="auto"/>
                               <w:outlineLvl w:val="9"/>
                               <w:rPr>
-                                <w:rFonts w:ascii="微软雅黑" w:hAnsi="微软雅黑" w:eastAsia="微软雅黑"/>
+                                <w:rFonts w:hint="eastAsia" w:ascii="微软雅黑" w:hAnsi="微软雅黑" w:eastAsia="微软雅黑"/>
                                 <w:color w:val="333333"/>
                               </w:rPr>
                             </w:pPr>
@@ -3189,79 +3267,7 @@
                                 <w:rFonts w:hint="eastAsia" w:ascii="微软雅黑" w:hAnsi="微软雅黑" w:eastAsia="微软雅黑"/>
                                 <w:color w:val="333333"/>
                               </w:rPr>
-                              <w:t>从事科普漫画的绘制，并担任漫画主笔</w:t>
-                            </w:r>
-                          </w:p>
-                          <w:p>
-                            <w:pPr>
-                              <w:keepNext w:val="0"/>
-                              <w:keepLines w:val="0"/>
-                              <w:pageBreakBefore w:val="0"/>
-                              <w:widowControl w:val="0"/>
-                              <w:numPr>
-                                <w:ilvl w:val="0"/>
-                                <w:numId w:val="1"/>
-                              </w:numPr>
-                              <w:kinsoku/>
-                              <w:wordWrap/>
-                              <w:overflowPunct/>
-                              <w:topLinePunct w:val="0"/>
-                              <w:autoSpaceDE/>
-                              <w:autoSpaceDN/>
-                              <w:bidi w:val="0"/>
-                              <w:adjustRightInd/>
-                              <w:spacing w:line="360" w:lineRule="exact"/>
-                              <w:ind w:right="0" w:rightChars="0"/>
-                              <w:jc w:val="left"/>
-                              <w:textAlignment w:val="auto"/>
-                              <w:outlineLvl w:val="9"/>
-                              <w:rPr>
-                                <w:rFonts w:ascii="微软雅黑" w:hAnsi="微软雅黑" w:eastAsia="微软雅黑"/>
-                                <w:color w:val="333333"/>
-                              </w:rPr>
-                            </w:pPr>
-                            <w:r>
-                              <w:rPr>
-                                <w:rFonts w:hint="eastAsia" w:ascii="微软雅黑" w:hAnsi="微软雅黑" w:eastAsia="微软雅黑"/>
-                                <w:color w:val="333333"/>
-                              </w:rPr>
-                              <w:t>负责设定人物形象，整体风格，色彩等</w:t>
-                            </w:r>
-                          </w:p>
-                          <w:p>
-                            <w:pPr>
-                              <w:keepNext w:val="0"/>
-                              <w:keepLines w:val="0"/>
-                              <w:pageBreakBefore w:val="0"/>
-                              <w:widowControl w:val="0"/>
-                              <w:numPr>
-                                <w:ilvl w:val="0"/>
-                                <w:numId w:val="1"/>
-                              </w:numPr>
-                              <w:kinsoku/>
-                              <w:wordWrap/>
-                              <w:overflowPunct/>
-                              <w:topLinePunct w:val="0"/>
-                              <w:autoSpaceDE/>
-                              <w:autoSpaceDN/>
-                              <w:bidi w:val="0"/>
-                              <w:adjustRightInd/>
-                              <w:spacing w:line="360" w:lineRule="exact"/>
-                              <w:ind w:right="0" w:rightChars="0"/>
-                              <w:jc w:val="left"/>
-                              <w:textAlignment w:val="auto"/>
-                              <w:outlineLvl w:val="9"/>
-                              <w:rPr>
-                                <w:rFonts w:hint="eastAsia" w:ascii="微软雅黑" w:hAnsi="微软雅黑" w:eastAsia="微软雅黑"/>
-                                <w:color w:val="333333"/>
-                              </w:rPr>
-                            </w:pPr>
-                            <w:r>
-                              <w:rPr>
-                                <w:rFonts w:hint="eastAsia" w:ascii="微软雅黑" w:hAnsi="微软雅黑" w:eastAsia="微软雅黑"/>
-                                <w:color w:val="333333"/>
-                              </w:rPr>
-                              <w:t>分配其他漫画师的工作，保证作品能按时并且高质量完成</w:t>
+                              <w:t/>
                             </w:r>
                           </w:p>
                         </w:txbxContent>
@@ -3284,7 +3290,7 @@
                 <o:lock v:ext="edit" aspectratio="f"/>
                 <v:textbox style="mso-fit-shape-to-text:t;">
                   <w:txbxContent>
-                    <w:p>
+                    <w:p delIfEmpty="1">
                       <w:pPr>
                         <w:keepNext w:val="0"/>
                         <w:keepLines w:val="0"/>
@@ -3310,10 +3316,10 @@
                       </w:pPr>
                       <w:r>
                         <w:rPr>
-                          <w:rFonts w:hint="eastAsia" w:ascii="微软雅黑" w:hAnsi="微软雅黑" w:eastAsia="微软雅黑"/>
+                          <w:rFonts w:hint="eastAsia" w:ascii="微软雅黑" w:hAnsi="微软雅黑" w:eastAsia="微软雅黑" w:cs="微软雅黑"/>
                           <w:color w:val="47BAC2"/>
                         </w:rPr>
-                        <w:t>{{ exp_company }}</w:t>
+                        <w:t>{{ exp_company2 }}</w:t>
                       </w:r>
                       <w:r>
                         <w:rPr>
@@ -3324,10 +3330,10 @@
                       </w:r>
                       <w:r>
                         <w:rPr>
-                          <w:rFonts w:hint="eastAsia" w:ascii="微软雅黑" w:hAnsi="微软雅黑" w:eastAsia="微软雅黑"/>
+                          <w:rFonts w:hint="eastAsia" w:ascii="微软雅黑" w:hAnsi="微软雅黑" w:eastAsia="微软雅黑" w:cs="微软雅黑"/>
                           <w:color w:val="47BAC2"/>
                         </w:rPr>
-                        <w:t xml:space="preserve">     {{ exp_role }}</w:t>
+                        <w:t xml:space="preserve">     {{ exp_role2 }}</w:t>
                       </w:r>
                       <w:r>
                         <w:rPr>
@@ -3338,13 +3344,13 @@
                       </w:r>
                       <w:r>
                         <w:rPr>
-                          <w:rFonts w:hint="eastAsia" w:ascii="微软雅黑" w:hAnsi="微软雅黑" w:eastAsia="微软雅黑"/>
+                          <w:rFonts w:hint="eastAsia" w:ascii="微软雅黑" w:hAnsi="微软雅黑" w:eastAsia="微软雅黑" w:cs="微软雅黑"/>
                           <w:color w:val="47BAC2"/>
                         </w:rPr>
-                        <w:t xml:space="preserve">        {{ edu_date }}</w:t>
+                        <w:t xml:space="preserve">        {{ exp_date2 }}</w:t>
                       </w:r>
                     </w:p>
-                    <w:p>
+                    <w:p delIfEmpty="1">
                       <w:pPr>
                         <w:keepNext w:val="0"/>
                         <w:keepLines w:val="0"/>
@@ -3374,13 +3380,13 @@
                       </w:pPr>
                       <w:r>
                         <w:rPr>
-                          <w:rFonts w:hint="eastAsia" w:ascii="微软雅黑" w:hAnsi="微软雅黑" w:eastAsia="微软雅黑"/>
+                          <w:rFonts w:hint="eastAsia" w:ascii="微软雅黑" w:hAnsi="微软雅黑" w:eastAsia="微软雅黑" w:cs="微软雅黑"/>
                           <w:color w:val="333333"/>
                         </w:rPr>
-                        <w:t>从事科普漫画的绘制，并担任漫画主笔</w:t>
+                        <w:t>{{ exp_desc2 }}</w:t>
                       </w:r>
                     </w:p>
-                    <w:p>
+                    <w:p delIfEmpty="1">
                       <w:pPr>
                         <w:keepNext w:val="0"/>
                         <w:keepLines w:val="0"/>
@@ -3413,10 +3419,10 @@
                           <w:rFonts w:hint="eastAsia" w:ascii="微软雅黑" w:hAnsi="微软雅黑" w:eastAsia="微软雅黑"/>
                           <w:color w:val="333333"/>
                         </w:rPr>
-                        <w:t>负责设定人物形象，整体风格，色彩等</w:t>
+                        <w:t/>
                       </w:r>
                     </w:p>
-                    <w:p>
+                    <w:p delIfEmpty="1">
                       <w:pPr>
                         <w:keepNext w:val="0"/>
                         <w:keepLines w:val="0"/>
@@ -3449,10 +3455,10 @@
                           <w:rFonts w:hint="eastAsia" w:ascii="微软雅黑" w:hAnsi="微软雅黑" w:eastAsia="微软雅黑"/>
                           <w:color w:val="333333"/>
                         </w:rPr>
-                        <w:t>分配其他漫画师的工作，保证作品能按时并且高质量完成</w:t>
+                        <w:t/>
                       </w:r>
                     </w:p>
-                    <w:p>
+                    <w:p delIfEmpty="1">
                       <w:pPr>
                         <w:keepNext w:val="0"/>
                         <w:keepLines w:val="0"/>
@@ -3478,10 +3484,10 @@
                       </w:pPr>
                       <w:r>
                         <w:rPr>
-                          <w:rFonts w:hint="eastAsia" w:ascii="微软雅黑" w:hAnsi="微软雅黑" w:eastAsia="微软雅黑"/>
+                          <w:rFonts w:hint="eastAsia" w:ascii="微软雅黑" w:hAnsi="微软雅黑" w:eastAsia="微软雅黑" w:cs="微软雅黑"/>
                           <w:color w:val="47BAC2"/>
                         </w:rPr>
-                        <w:t>{{ exp_company }}</w:t>
+                        <w:t>{{ exp_company2 }}</w:t>
                       </w:r>
                       <w:r>
                         <w:rPr>
@@ -3492,10 +3498,10 @@
                       </w:r>
                       <w:r>
                         <w:rPr>
-                          <w:rFonts w:hint="eastAsia" w:ascii="微软雅黑" w:hAnsi="微软雅黑" w:eastAsia="微软雅黑"/>
+                          <w:rFonts w:hint="eastAsia" w:ascii="微软雅黑" w:hAnsi="微软雅黑" w:eastAsia="微软雅黑" w:cs="微软雅黑"/>
                           <w:color w:val="47BAC2"/>
                         </w:rPr>
-                        <w:t xml:space="preserve">     {{ exp_role }}</w:t>
+                        <w:t xml:space="preserve">     {{ exp_role2 }}</w:t>
                       </w:r>
                       <w:r>
                         <w:rPr>
@@ -3506,13 +3512,13 @@
                       </w:r>
                       <w:r>
                         <w:rPr>
-                          <w:rFonts w:hint="eastAsia" w:ascii="微软雅黑" w:hAnsi="微软雅黑" w:eastAsia="微软雅黑"/>
+                          <w:rFonts w:hint="eastAsia" w:ascii="微软雅黑" w:hAnsi="微软雅黑" w:eastAsia="微软雅黑" w:cs="微软雅黑"/>
                           <w:color w:val="47BAC2"/>
                         </w:rPr>
-                        <w:t xml:space="preserve">        {{ edu_date }}</w:t>
+                        <w:t xml:space="preserve">        {{ exp_date2 }}</w:t>
                       </w:r>
                     </w:p>
-                    <w:p>
+                    <w:p delIfEmpty="1">
                       <w:pPr>
                         <w:keepNext w:val="0"/>
                         <w:keepLines w:val="0"/>
@@ -3542,13 +3548,13 @@
                       </w:pPr>
                       <w:r>
                         <w:rPr>
-                          <w:rFonts w:hint="eastAsia" w:ascii="微软雅黑" w:hAnsi="微软雅黑" w:eastAsia="微软雅黑"/>
+                          <w:rFonts w:hint="eastAsia" w:ascii="微软雅黑" w:hAnsi="微软雅黑" w:eastAsia="微软雅黑" w:cs="微软雅黑"/>
                           <w:color w:val="333333"/>
                         </w:rPr>
-                        <w:t>从事科普漫画的绘制，并担任漫画主笔</w:t>
+                        <w:t>{{ exp_desc2 }}</w:t>
                       </w:r>
                     </w:p>
-                    <w:p>
+                    <w:p delIfEmpty="1">
                       <w:pPr>
                         <w:keepNext w:val="0"/>
                         <w:keepLines w:val="0"/>
@@ -3581,10 +3587,10 @@
                           <w:rFonts w:hint="eastAsia" w:ascii="微软雅黑" w:hAnsi="微软雅黑" w:eastAsia="微软雅黑"/>
                           <w:color w:val="333333"/>
                         </w:rPr>
-                        <w:t>负责设定人物形象，整体风格，色彩等</w:t>
+                        <w:t/>
                       </w:r>
                     </w:p>
-                    <w:p>
+                    <w:p delIfEmpty="1">
                       <w:pPr>
                         <w:keepNext w:val="0"/>
                         <w:keepLines w:val="0"/>
@@ -3617,7 +3623,7 @@
                           <w:rFonts w:hint="eastAsia" w:ascii="微软雅黑" w:hAnsi="微软雅黑" w:eastAsia="微软雅黑"/>
                           <w:color w:val="333333"/>
                         </w:rPr>
-                        <w:t>分配其他漫画师的工作，保证作品能按时并且高质量完成</w:t>
+                        <w:t/>
                       </w:r>
                     </w:p>
                   </w:txbxContent>
@@ -4628,6 +4634,7 @@
       <w:r>
         <w:rPr>
           <w:sz w:val="21"/>
+          <w:rFonts w:ascii="微软雅黑" w:hAnsi="微软雅黑" w:eastAsia="微软雅黑" w:cs="微软雅黑" w:hint="eastAsia"/>
         </w:rPr>
         <mc:AlternateContent>
           <mc:Choice Requires="wps">
@@ -4712,7 +4719,7 @@
                                 <w:sz w:val="20"/>
                                 <w:szCs w:val="20"/>
                               </w:rPr>
-                              <w:t>{{ skill_3 }}</w:t>
+                              <w:t>{{ skill1 }}</w:t>
                             </w:r>
                           </w:p>
                         </w:txbxContent>
@@ -4769,7 +4776,7 @@
                           <w:sz w:val="20"/>
                           <w:szCs w:val="20"/>
                         </w:rPr>
-                        <w:t>{{ skill_3 }}</w:t>
+                        <w:t>{{ skill1 }}</w:t>
                       </w:r>
                     </w:p>
                   </w:txbxContent>
@@ -4782,6 +4789,7 @@
       <w:r>
         <w:rPr>
           <w:sz w:val="21"/>
+          <w:rFonts w:ascii="微软雅黑" w:hAnsi="微软雅黑" w:eastAsia="微软雅黑" w:cs="微软雅黑" w:hint="eastAsia"/>
         </w:rPr>
         <mc:AlternateContent>
           <mc:Choice Requires="wps">
@@ -4866,7 +4874,7 @@
                                 <w:sz w:val="20"/>
                                 <w:szCs w:val="20"/>
                               </w:rPr>
-                              <w:t>{{ skill_2 }}</w:t>
+                              <w:t>{{ skill2 }}</w:t>
                             </w:r>
                           </w:p>
                         </w:txbxContent>
@@ -4923,7 +4931,7 @@
                           <w:sz w:val="20"/>
                           <w:szCs w:val="20"/>
                         </w:rPr>
-                        <w:t>{{ skill_2 }}</w:t>
+                        <w:t>{{ skill2 }}</w:t>
                       </w:r>
                     </w:p>
                   </w:txbxContent>
@@ -4938,6 +4946,7 @@
       <w:r>
         <w:rPr>
           <w:sz w:val="21"/>
+          <w:rFonts w:ascii="微软雅黑" w:hAnsi="微软雅黑" w:eastAsia="微软雅黑" w:cs="微软雅黑" w:hint="eastAsia"/>
         </w:rPr>
         <mc:AlternateContent>
           <mc:Choice Requires="wps">
@@ -5022,7 +5031,7 @@
                                 <w:sz w:val="20"/>
                                 <w:szCs w:val="20"/>
                               </w:rPr>
-                              <w:t>{{ skill_1 }}</w:t>
+                              <w:t>{{ skill3 }}</w:t>
                             </w:r>
                           </w:p>
                         </w:txbxContent>
@@ -5079,7 +5088,7 @@
                           <w:sz w:val="20"/>
                           <w:szCs w:val="20"/>
                         </w:rPr>
-                        <w:t>{{ skill_1 }}</w:t>
+                        <w:t>{{ skill3 }}</w:t>
                       </w:r>
                     </w:p>
                   </w:txbxContent>
@@ -5092,6 +5101,7 @@
       <w:r>
         <w:rPr>
           <w:sz w:val="21"/>
+          <w:rFonts w:ascii="微软雅黑" w:hAnsi="微软雅黑" w:eastAsia="微软雅黑" w:cs="微软雅黑" w:hint="eastAsia"/>
         </w:rPr>
         <mc:AlternateContent>
           <mc:Choice Requires="wps">
@@ -5142,7 +5152,7 @@
                       </wps:style>
                       <wps:txbx>
                         <w:txbxContent>
-                          <w:p>
+                          <w:p delIfEmpty="1">
                             <w:pPr>
                               <w:keepNext w:val="0"/>
                               <w:keepLines w:val="0"/>
@@ -5173,13 +5183,13 @@
                             </w:pPr>
                             <w:r>
                               <w:rPr>
-                                <w:rFonts w:hint="eastAsia" w:ascii="微软雅黑" w:hAnsi="微软雅黑" w:eastAsia="微软雅黑"/>
+                                <w:rFonts w:hint="eastAsia" w:ascii="微软雅黑" w:hAnsi="微软雅黑" w:eastAsia="微软雅黑" w:cs="微软雅黑"/>
                                 <w:color w:val="333333"/>
                               </w:rPr>
-                              <w:t>2008年获得校园文化先进分子称号</w:t>
+                              <w:t>{{ honors }}</w:t>
                             </w:r>
                           </w:p>
-                          <w:p>
+                          <w:p delIfEmpty="1">
                             <w:pPr>
                               <w:keepNext w:val="0"/>
                               <w:keepLines w:val="0"/>
@@ -5213,10 +5223,10 @@
                                 <w:rFonts w:hint="eastAsia" w:ascii="微软雅黑" w:hAnsi="微软雅黑" w:eastAsia="微软雅黑"/>
                                 <w:color w:val="333333"/>
                               </w:rPr>
-                              <w:t>2009年获国家奖学金</w:t>
+                              <w:t/>
                             </w:r>
                           </w:p>
-                          <w:p>
+                          <w:p delIfEmpty="1">
                             <w:pPr>
                               <w:keepNext w:val="0"/>
                               <w:keepLines w:val="0"/>
@@ -5250,10 +5260,10 @@
                                 <w:rFonts w:hint="eastAsia" w:ascii="微软雅黑" w:hAnsi="微软雅黑" w:eastAsia="微软雅黑"/>
                                 <w:color w:val="333333"/>
                               </w:rPr>
-                              <w:t>2010年获省三好学生</w:t>
+                              <w:t/>
                             </w:r>
                           </w:p>
-                          <w:p>
+                          <w:p delIfEmpty="1">
                             <w:pPr>
                               <w:keepNext w:val="0"/>
                               <w:keepLines w:val="0"/>
@@ -5287,10 +5297,10 @@
                                 <w:rFonts w:hint="eastAsia" w:ascii="微软雅黑" w:hAnsi="微软雅黑" w:eastAsia="微软雅黑"/>
                                 <w:color w:val="333333"/>
                               </w:rPr>
-                              <w:t>2010年获“青年梦”主题动漫展优秀作品奖</w:t>
+                              <w:t/>
                             </w:r>
                           </w:p>
-                          <w:p>
+                          <w:p delIfEmpty="1">
                             <w:pPr>
                               <w:keepNext w:val="0"/>
                               <w:keepLines w:val="0"/>
@@ -5324,10 +5334,10 @@
                                 <w:rFonts w:hint="eastAsia" w:ascii="微软雅黑" w:hAnsi="微软雅黑" w:eastAsia="微软雅黑"/>
                                 <w:color w:val="333333"/>
                               </w:rPr>
-                              <w:t>2012年重彩壁画临摹作品入选万点美院重彩画展</w:t>
+                              <w:t/>
                             </w:r>
                           </w:p>
-                          <w:p>
+                          <w:p delIfEmpty="1">
                             <w:pPr>
                               <w:keepNext w:val="0"/>
                               <w:keepLines w:val="0"/>
@@ -5357,7 +5367,7 @@
                                 <w:rFonts w:hint="eastAsia" w:ascii="微软雅黑" w:hAnsi="微软雅黑" w:eastAsia="微软雅黑"/>
                                 <w:color w:val="333333"/>
                               </w:rPr>
-                              <w:t>2012年担任万点映画乐风动漫社社长</w:t>
+                              <w:t/>
                             </w:r>
                           </w:p>
                         </w:txbxContent>
@@ -5380,7 +5390,7 @@
                 <o:lock v:ext="edit" aspectratio="f"/>
                 <v:textbox style="mso-fit-shape-to-text:t;">
                   <w:txbxContent>
-                    <w:p>
+                    <w:p delIfEmpty="1">
                       <w:pPr>
                         <w:keepNext w:val="0"/>
                         <w:keepLines w:val="0"/>
@@ -5411,13 +5421,13 @@
                       </w:pPr>
                       <w:r>
                         <w:rPr>
-                          <w:rFonts w:hint="eastAsia" w:ascii="微软雅黑" w:hAnsi="微软雅黑" w:eastAsia="微软雅黑"/>
+                          <w:rFonts w:hint="eastAsia" w:ascii="微软雅黑" w:hAnsi="微软雅黑" w:eastAsia="微软雅黑" w:cs="微软雅黑"/>
                           <w:color w:val="333333"/>
                         </w:rPr>
-                        <w:t>2008年获得校园文化先进分子称号</w:t>
+                        <w:t>{{ honors }}</w:t>
                       </w:r>
                     </w:p>
-                    <w:p>
+                    <w:p delIfEmpty="1">
                       <w:pPr>
                         <w:keepNext w:val="0"/>
                         <w:keepLines w:val="0"/>
@@ -5451,10 +5461,10 @@
                           <w:rFonts w:hint="eastAsia" w:ascii="微软雅黑" w:hAnsi="微软雅黑" w:eastAsia="微软雅黑"/>
                           <w:color w:val="333333"/>
                         </w:rPr>
-                        <w:t>2009年获国家奖学金</w:t>
+                        <w:t/>
                       </w:r>
                     </w:p>
-                    <w:p>
+                    <w:p delIfEmpty="1">
                       <w:pPr>
                         <w:keepNext w:val="0"/>
                         <w:keepLines w:val="0"/>
@@ -5488,10 +5498,10 @@
                           <w:rFonts w:hint="eastAsia" w:ascii="微软雅黑" w:hAnsi="微软雅黑" w:eastAsia="微软雅黑"/>
                           <w:color w:val="333333"/>
                         </w:rPr>
-                        <w:t>2010年获省三好学生</w:t>
+                        <w:t/>
                       </w:r>
                     </w:p>
-                    <w:p>
+                    <w:p delIfEmpty="1">
                       <w:pPr>
                         <w:keepNext w:val="0"/>
                         <w:keepLines w:val="0"/>
@@ -5525,10 +5535,10 @@
                           <w:rFonts w:hint="eastAsia" w:ascii="微软雅黑" w:hAnsi="微软雅黑" w:eastAsia="微软雅黑"/>
                           <w:color w:val="333333"/>
                         </w:rPr>
-                        <w:t>2010年获“青年梦”主题动漫展优秀作品奖</w:t>
+                        <w:t/>
                       </w:r>
                     </w:p>
-                    <w:p>
+                    <w:p delIfEmpty="1">
                       <w:pPr>
                         <w:keepNext w:val="0"/>
                         <w:keepLines w:val="0"/>
@@ -5562,10 +5572,10 @@
                           <w:rFonts w:hint="eastAsia" w:ascii="微软雅黑" w:hAnsi="微软雅黑" w:eastAsia="微软雅黑"/>
                           <w:color w:val="333333"/>
                         </w:rPr>
-                        <w:t>2012年重彩壁画临摹作品入选万点美院重彩画展</w:t>
+                        <w:t/>
                       </w:r>
                     </w:p>
-                    <w:p>
+                    <w:p delIfEmpty="1">
                       <w:pPr>
                         <w:keepNext w:val="0"/>
                         <w:keepLines w:val="0"/>
@@ -5595,7 +5605,7 @@
                           <w:rFonts w:hint="eastAsia" w:ascii="微软雅黑" w:hAnsi="微软雅黑" w:eastAsia="微软雅黑"/>
                           <w:color w:val="333333"/>
                         </w:rPr>
-                        <w:t>2012年担任万点映画乐风动漫社社长</w:t>
+                        <w:t/>
                       </w:r>
                     </w:p>
                   </w:txbxContent>

</xml_diff>